<commit_message>
Roadmap items: Theorem 5 (minimax), replication-rep notebook mode, REPLICATION.md
Theorem 5 (Appendix A.9): in the single-draw binary regime the observable
law is Bernoulli in the mean alone; two indistinguishable populations
differ in clean mean by exactly pi*Lambda; hence no procedure can certify
robustness beyond Delta/(pi(1+rho)). The SS9.2 reduction is now proved
information-theoretically optimal, not just observed. Pinned by two new
tests (59/59 green); first draft's non-extremal construction caught and
replaced during numeric verification.

Notebook generator gains RUN_MODE="corpus_mix_rep": 1.5B seeds {43,44} +
0.5B seed 42 over the dilution sweep, seed-aware checkpointing, ~5-6 h T4,
splittable across sessions. Output: contamctrl_corpusmix_rep_peritem.csv.

REPLICATION.md: fifteen-minute and three-hour independent replication
paths with expected outputs and a named-acknowledgment offer.

Co-Authored-By: Claude Opus 4.8 <noreply@anthropic.com>
</commit_message>
<xml_diff>
--- a/paper/contamsens_manuscript.docx
+++ b/paper/contamsens_manuscript.docx
@@ -2334,7 +2334,7 @@
         </w:rPr>
         <w:t xml:space="preserve">The protocol was pre-registered on the Open Science Framework (</w:t>
       </w:r>
-      <w:hyperlink w:history="1" r:id="rId3chntmeblycgdbeoiqlz_">
+      <w:hyperlink w:history="1" r:id="rIdpqp0lcj426u__ss2siqwu">
         <w:r>
           <w:rPr>
             <w:rFonts w:ascii="Times New Roman" w:cs="Times New Roman" w:eastAsia="Times New Roman" w:hAnsi="Times New Roman"/>
@@ -2619,7 +2619,25 @@
           <w:sz w:val="22"/>
           <w:szCs w:val="22"/>
         </w:rPr>
-        <w:t xml:space="preserve"> Γ* collapses to Δ̂/π only when items are binary and measured once, because the per-item deflation capacity degenerates (Lemma A.1): d(0) = d(1) = 0 for every Λ &lt; 1. That is a statement about how impoverished single-draw accuracy data is, and it is worth hearing. Where richer data exists the machinery genuinely separates: with continuous per-item scores the sharp knapsack binds strictly tighter than πΛ (§9, TSFM atlas), and at m = 20 repeated draws it certifies Γ* = 0.172 against the simple bound's 0.154 (§10). The leaderboards audited here publish the weakest data they could; the reduction is the price of that, and it is the argument for §10's prescription that benchmarks publish repeated draws.</w:t>
+        <w:t xml:space="preserve"> Γ* collapses to Δ̂/π only when items are binary and measured once, because the per-item deflation capacity degenerates (Lemma A.1): d(0) = d(1) = 0 for every Λ &lt; 1. That is a statement about how impoverished single-draw accuracy data is, and it is worth hearing — and it is now a theorem, not an observation. Theorem 5 (Appendix A.9) shows that with one binary draw per item the observable law is Bernoulli in the mean alone, exhibits two indistinguishable populations whose clean means differ by exactly πΛ, and concludes that </w:t>
+      </w:r>
+      <w:r>
+        <w:rPr>
+          <w:rFonts w:ascii="Times New Roman" w:cs="Times New Roman" w:eastAsia="Times New Roman" w:hAnsi="Times New Roman"/>
+          <w:i/>
+          <w:iCs/>
+          <w:sz w:val="22"/>
+          <w:szCs w:val="22"/>
+        </w:rPr>
+        <w:t xml:space="preserve">no</w:t>
+      </w:r>
+      <w:r>
+        <w:rPr>
+          <w:rFonts w:ascii="Times New Roman" w:cs="Times New Roman" w:eastAsia="Times New Roman" w:hAnsi="Times New Roman"/>
+          <w:sz w:val="22"/>
+          <w:szCs w:val="22"/>
+        </w:rPr>
+        <w:t xml:space="preserve"> procedure, ours or anyone's, can certify robustness beyond Δ̂/(π(1+ρ)) from such data. The ruler is minimax-optimal. Where richer data exists the machinery genuinely separates: with continuous per-item scores the sharp knapsack binds strictly tighter than πΛ (§9, TSFM atlas), and at m = 20 repeated draws it certifies Γ* = 0.172 against the simple bound's 0.154 (§10). The leaderboards audited here publish the weakest data they could; the reduction is the price of that, and it is the argument for §10's prescription that benchmarks publish repeated draws.</w:t>
       </w:r>
     </w:p>
     <w:p>
@@ -3733,7 +3751,7 @@
         </w:rPr>
         <w:t xml:space="preserve">Code, data artifacts, and this manuscript are public at </w:t>
       </w:r>
-      <w:hyperlink w:history="1" r:id="rIdkszffwstynnxeiabme-1w">
+      <w:hyperlink w:history="1" r:id="rIdlxisbnrxhjeqycr9dmiqq">
         <w:r>
           <w:rPr>
             <w:rFonts w:ascii="Times New Roman" w:cs="Times New Roman" w:eastAsia="Times New Roman" w:hAnsi="Times New Roman"/>
@@ -3831,7 +3849,7 @@
         </w:rPr>
         <w:t xml:space="preserve">The confirmatory analysis (§9.1) was pre-registered at </w:t>
       </w:r>
-      <w:hyperlink w:history="1" r:id="rIdkhk0ekzyspx7wvrtdg9t9">
+      <w:hyperlink w:history="1" r:id="rId_mfycooxwonqjdkudptri">
         <w:r>
           <w:rPr>
             <w:rFonts w:ascii="Times New Roman" w:cs="Times New Roman" w:eastAsia="Times New Roman" w:hAnsi="Times New Roman"/>
@@ -4976,6 +4994,169 @@
           <w:szCs w:val="20"/>
         </w:rPr>
         <w:t xml:space="preserve">p2b_spillover_fix.csv</w:t>
+      </w:r>
+      <w:r>
+        <w:rPr>
+          <w:rFonts w:ascii="Times New Roman" w:cs="Times New Roman" w:eastAsia="Times New Roman" w:hAnsi="Times New Roman"/>
+          <w:sz w:val="22"/>
+          <w:szCs w:val="22"/>
+        </w:rPr>
+        <w:t xml:space="preserve">]</w:t>
+      </w:r>
+    </w:p>
+    <w:p>
+      <w:pPr>
+        <w:pStyle w:val="Heading1"/>
+      </w:pPr>
+      <w:r>
+        <w:rPr>
+          <w:rFonts w:ascii="Times New Roman" w:cs="Times New Roman" w:eastAsia="Times New Roman" w:hAnsi="Times New Roman"/>
+          <w:sz w:val="22"/>
+          <w:szCs w:val="22"/>
+        </w:rPr>
+        <w:t xml:space="preserve">A.9 Theorem 5 (minimax optimality of the simple bound in the binary regime)</w:t>
+      </w:r>
+    </w:p>
+    <w:p>
+      <w:pPr>
+        <w:spacing w:after="120" w:line="300"/>
+        <w:jc w:val="both"/>
+      </w:pPr>
+      <w:r>
+        <w:rPr>
+          <w:rFonts w:ascii="Times New Roman" w:cs="Times New Roman" w:eastAsia="Times New Roman" w:hAnsi="Times New Roman"/>
+          <w:b/>
+          <w:bCs/>
+          <w:sz w:val="22"/>
+          <w:szCs w:val="22"/>
+        </w:rPr>
+        <w:t xml:space="preserve">Setting.</w:t>
+      </w:r>
+      <w:r>
+        <w:rPr>
+          <w:rFonts w:ascii="Times New Roman" w:cs="Times New Roman" w:eastAsia="Times New Roman" w:hAnsi="Times New Roman"/>
+          <w:sz w:val="22"/>
+          <w:szCs w:val="22"/>
+        </w:rPr>
+        <w:t xml:space="preserve"> Single-draw binary regime R2 under the iid item sampling of Theorem 4: items are drawn from a population P over (p*, c, δ); the analyst observes one draw y ~ Bernoulli(p) per item, p = p* + cδ, with E[c] ≤ π and, in CSM±, −Λ⁻p* ≤ δ ≤ Λ⁺(1 − p*). The estimand is θ(P) = E[p*]; write μ(P) = E[p] and Λ = Λ⁺.</w:t>
+      </w:r>
+    </w:p>
+    <w:p>
+      <w:pPr>
+        <w:spacing w:after="120" w:line="300"/>
+        <w:jc w:val="both"/>
+      </w:pPr>
+      <w:r>
+        <w:rPr>
+          <w:rFonts w:ascii="Times New Roman" w:cs="Times New Roman" w:eastAsia="Times New Roman" w:hAnsi="Times New Roman"/>
+          <w:b/>
+          <w:bCs/>
+          <w:sz w:val="22"/>
+          <w:szCs w:val="22"/>
+        </w:rPr>
+        <w:t xml:space="preserve">Theorem 5 (statement).</w:t>
+      </w:r>
+      <w:r>
+        <w:rPr>
+          <w:rFonts w:ascii="Times New Roman" w:cs="Times New Roman" w:eastAsia="Times New Roman" w:hAnsi="Times New Roman"/>
+          <w:sz w:val="22"/>
+          <w:szCs w:val="22"/>
+        </w:rPr>
+        <w:t xml:space="preserve"> (i) With one draw per item the observable law is iid Bernoulli(μ(P)): populations with equal μ are exactly indistinguishable at every sample size. (ii) For interior μ (πΛ ≤ μ ≤ 1 − π(1−Λ)), the identified set for θ given μ is exactly [μ − πΛ, μ] at ρ = 0, and the width πΛ is attained by a feasible population. (iii) Any interval procedure uniformly valid over the model class has width at least πΛ; any claim-robustness procedure can certify at most Γ* = Δ/(π(1+ρ)). The reduction of §9.2 is therefore not a limitation of our estimator: it is the full information content of single-draw binary data.</w:t>
+      </w:r>
+    </w:p>
+    <w:p>
+      <w:pPr>
+        <w:spacing w:after="120" w:line="300"/>
+        <w:jc w:val="both"/>
+      </w:pPr>
+      <w:r>
+        <w:rPr>
+          <w:rFonts w:ascii="Times New Roman" w:cs="Times New Roman" w:eastAsia="Times New Roman" w:hAnsi="Times New Roman"/>
+          <w:b/>
+          <w:bCs/>
+          <w:sz w:val="22"/>
+          <w:szCs w:val="22"/>
+        </w:rPr>
+        <w:t xml:space="preserve">Proof.</w:t>
+      </w:r>
+      <w:r>
+        <w:rPr>
+          <w:rFonts w:ascii="Times New Roman" w:cs="Times New Roman" w:eastAsia="Times New Roman" w:hAnsi="Times New Roman"/>
+          <w:sz w:val="22"/>
+          <w:szCs w:val="22"/>
+        </w:rPr>
+        <w:t xml:space="preserve"> (i) Conditional on an item, y is Bernoulli(p); marginalising over P, a single draw is Bernoulli(E[p]) and items are iid, so the sample is iid Bernoulli(μ). Higher moments of p are not identified with one draw per item. (ii) Upper endpoint: at ρ = 0, δ ≥ 0, so θ ≤ μ, attained by the uncontaminated population p* ≡ μ. Lower endpoint: feasibility requires δ ≤ min(p, Λ(1 − p*)) and the two constraints cross at p = Λ, where p* = 0 and δ = Λ are simultaneously feasible; so per-item bias is at most Λ and E[cδ] ≤ πΛ. Attainment: let P₂ place mass π on contaminated items with p* = 0, δ = Λ (hence p = Λ) and mass 1 − π on clean items with p* = (μ − πΛ)/(1 − π), which lies in [0, 1] exactly on the stated interior range. Then μ(P₂) = μ and θ(P₂) = μ − πΛ. The population P₁ with p* ≡ μ, c ≡ 0 has μ(P₁) = μ and θ(P₁) = μ. By (i) the two are indistinguishable, so both endpoints belong to the identified set, and by the bias bound nothing below μ − πΛ does. (iii) A uniformly valid interval must contain θ(P₁) = μ and θ(P₂) = μ − πΛ on data laws it cannot tell apart, hence has width ≥ πΛ. For a claim A ≻ B with margin Δ, applying the P₂ construction to model A (deflation at Λ⁺) and its mirror to model B (inflation at Λ⁻ = ρΛ⁺) reverses the population margin whenever πΛ(1 + ρ) &gt; Δ while leaving both observable laws unchanged; hence no procedure can certify robustness at any Λ &gt; Δ/(π(1+ρ)). ∎</w:t>
+      </w:r>
+    </w:p>
+    <w:p>
+      <w:pPr>
+        <w:spacing w:after="120" w:line="300"/>
+        <w:jc w:val="both"/>
+      </w:pPr>
+      <w:r>
+        <w:rPr>
+          <w:rFonts w:ascii="Times New Roman" w:cs="Times New Roman" w:eastAsia="Times New Roman" w:hAnsi="Times New Roman"/>
+          <w:sz w:val="22"/>
+          <w:szCs w:val="22"/>
+        </w:rPr>
+        <w:t xml:space="preserve">The library's </w:t>
+      </w:r>
+      <w:r>
+        <w:rPr>
+          <w:rFonts w:ascii="Consolas" w:cs="Consolas" w:eastAsia="Consolas" w:hAnsi="Consolas"/>
+          <w:sz w:val="20"/>
+          <w:szCs w:val="20"/>
+        </w:rPr>
+        <w:t xml:space="preserve">max_bias_simple</w:t>
+      </w:r>
+      <w:r>
+        <w:rPr>
+          <w:rFonts w:ascii="Times New Roman" w:cs="Times New Roman" w:eastAsia="Times New Roman" w:hAnsi="Times New Roman"/>
+          <w:sz w:val="22"/>
+          <w:szCs w:val="22"/>
+        </w:rPr>
+        <w:t xml:space="preserve"> reports exactly this width, and </w:t>
+      </w:r>
+      <w:r>
+        <w:rPr>
+          <w:rFonts w:ascii="Consolas" w:cs="Consolas" w:eastAsia="Consolas" w:hAnsi="Consolas"/>
+          <w:sz w:val="20"/>
+          <w:szCs w:val="20"/>
+        </w:rPr>
+        <w:t xml:space="preserve">gamma_star(..., simple=True)</w:t>
+      </w:r>
+      <w:r>
+        <w:rPr>
+          <w:rFonts w:ascii="Times New Roman" w:cs="Times New Roman" w:eastAsia="Times New Roman" w:hAnsi="Times New Roman"/>
+          <w:sz w:val="22"/>
+          <w:szCs w:val="22"/>
+        </w:rPr>
+        <w:t xml:space="preserve"> the certificate ceiling. [</w:t>
+      </w:r>
+      <w:r>
+        <w:rPr>
+          <w:rFonts w:ascii="Consolas" w:cs="Consolas" w:eastAsia="Consolas" w:hAnsi="Consolas"/>
+          <w:sz w:val="20"/>
+          <w:szCs w:val="20"/>
+        </w:rPr>
+        <w:t xml:space="preserve">test_minimax_indistinguishable_pair</w:t>
+      </w:r>
+      <w:r>
+        <w:rPr>
+          <w:rFonts w:ascii="Times New Roman" w:cs="Times New Roman" w:eastAsia="Times New Roman" w:hAnsi="Times New Roman"/>
+          <w:sz w:val="22"/>
+          <w:szCs w:val="22"/>
+        </w:rPr>
+        <w:t xml:space="preserve">, </w:t>
+      </w:r>
+      <w:r>
+        <w:rPr>
+          <w:rFonts w:ascii="Consolas" w:cs="Consolas" w:eastAsia="Consolas" w:hAnsi="Consolas"/>
+          <w:sz w:val="20"/>
+          <w:szCs w:val="20"/>
+        </w:rPr>
+        <w:t xml:space="preserve">test_minimax_no_narrower_certificate</w:t>
       </w:r>
       <w:r>
         <w:rPr>

</xml_diff>

<commit_message>
Multi-seed + second-model dilution replication integrated (SS7, SS11)
User's corpus_mix_rep Kaggle run arrived complete despite the interrupted
session (checkpointing recovered all 18 configs, 0 NaNs). Replication
verdict, stated honestly in the paper: the consolidation endpoint
replicates almost exactly (Lambda_q95 = 0.976/0.988/0.982 across seeds,
range 0.012) and the dose-4 trend is monotone in every seed; the dose-1
diluted endpoint replicates inside the field range (0.286-0.346); the
dose-1 concentrated level is seed-noisy (0.27-0.58), so the paper now
claims only the seed-stable findings and says which is which. 0.5B shows
the same structure at lower levels, consistent with the capacity law.
Limitation SS11(1) updated: three seeds, two models, honest noise split.

Co-Authored-By: Claude Opus 4.8 <noreply@anthropic.com>
</commit_message>
<xml_diff>
--- a/paper/contamsens_manuscript.docx
+++ b/paper/contamsens_manuscript.docx
@@ -1853,7 +1853,43 @@
           <w:sz w:val="22"/>
           <w:szCs w:val="22"/>
         </w:rPr>
-        <w:t xml:space="preserve"> memorization. Deliberate or repeated contamination (a benchmark recurring in a fine-tuning mix) saturates toward Λ = 1 no matter how diluted the corpus. Both movements dwarf the measured session-reproduction noise (≤ 0.039 on Λ̂_q95, from re-running identical configs on fresh GPU sessions; the clean-twin scores and contamination indices reproduce exactly). The practical consequences: the field range is </w:t>
+        <w:t xml:space="preserve"> memorization. Deliberate or repeated contamination (a benchmark recurring in a fine-tuning mix) saturates toward Λ = 1 no matter how diluted the corpus. A replication over three seeds and a second model sharpens what is stable and what is not. The consolidation endpoint replicates almost exactly: Λ̂_q95 at dose 4, mix 20 is 0.976, 0.988, 0.982 across seeds (range 0.012), and the dose-4 upward trend is monotone in every seed. The dose-1 </w:t>
+      </w:r>
+      <w:r>
+        <w:rPr>
+          <w:rFonts w:ascii="Times New Roman" w:cs="Times New Roman" w:eastAsia="Times New Roman" w:hAnsi="Times New Roman"/>
+          <w:i/>
+          <w:iCs/>
+          <w:sz w:val="22"/>
+          <w:szCs w:val="22"/>
+        </w:rPr>
+        <w:t xml:space="preserve">diluted endpoint</w:t>
+      </w:r>
+      <w:r>
+        <w:rPr>
+          <w:rFonts w:ascii="Times New Roman" w:cs="Times New Roman" w:eastAsia="Times New Roman" w:hAnsi="Times New Roman"/>
+          <w:sz w:val="22"/>
+          <w:szCs w:val="22"/>
+        </w:rPr>
+        <w:t xml:space="preserve"> also replicates inside the field range (0.286–0.346 across seeds). The dose-1 </w:t>
+      </w:r>
+      <w:r>
+        <w:rPr>
+          <w:rFonts w:ascii="Times New Roman" w:cs="Times New Roman" w:eastAsia="Times New Roman" w:hAnsi="Times New Roman"/>
+          <w:i/>
+          <w:iCs/>
+          <w:sz w:val="22"/>
+          <w:szCs w:val="22"/>
+        </w:rPr>
+        <w:t xml:space="preserve">concentrated starting point</w:t>
+      </w:r>
+      <w:r>
+        <w:rPr>
+          <w:rFonts w:ascii="Times New Roman" w:cs="Times New Roman" w:eastAsia="Times New Roman" w:hAnsi="Times New Roman"/>
+          <w:sz w:val="22"/>
+          <w:szCs w:val="22"/>
+        </w:rPr>
+        <w:t xml:space="preserve">, by contrast, is seed-noisy (0.27–0.58): a single light exposure produces an unstable memorization level, so we claim the diluted endpoint and the consolidation law as replicated findings and treat the concentrated dose-1 level as noisy. The 0.5B model shows the same structure at lower levels (dose-1 lift ≈ 0, dose-4 consolidation 0.68 → 0.76), consistent with the capacity law. The practical consequences: the field range is </w:t>
       </w:r>
       <w:r>
         <w:rPr>
@@ -2334,7 +2370,7 @@
         </w:rPr>
         <w:t xml:space="preserve">The protocol was pre-registered on the Open Science Framework (</w:t>
       </w:r>
-      <w:hyperlink w:history="1" r:id="rIdpqp0lcj426u__ss2siqwu">
+      <w:hyperlink w:history="1" r:id="rIddukfhxt088fhwz_zdha1n">
         <w:r>
           <w:rPr>
             <w:rFonts w:ascii="Times New Roman" w:cs="Times New Roman" w:eastAsia="Times New Roman" w:hAnsi="Times New Roman"/>
@@ -3665,7 +3701,7 @@
           <w:sz w:val="22"/>
           <w:szCs w:val="22"/>
         </w:rPr>
-        <w:t xml:space="preserve">(1) A1's channel shape is validated with real memorization at small scale, LLM scale, and now under corpus dilution (§7); the remaining gap is scale itself: our largest injection model is 1.5B parameters and the dilution sweep covers one model, one π, and a single seed per configuration (session-reproduction noise is measured at ≤ 0.039 on Λ̂_q95, well below the effects reported, but a multi-seed replication would still tighten it). The dose-1 dilution result lands inside the field range; whether that interpolation holds at 70B-scale pretraining is an extrapolation we flag, not a measurement we own. (2) In the single-draw binary regime (most current leaderboards), (Λ, π) enter only through their product; the 2-D frontier earns its second dimension only under repeated draws or provenance strata; we say so plainly, and §10 is the constructive answer. (3) Λ calibration from pre/post-cutoff comparisons can be confounded by temporal drift; the pre-registration pairs items on difficulty and reports calibration uncertainty. (4) Both case studies are exploratory; the headline audit is governed by a pre-registration frozen before any confirmatory Γ* is computed. (5) ε-spillover should vanish at LLM corpus scale but is measured, not assumed. (6) This artifact was audited by its own author (four forensic iterations, including a critical binary-regime guard); an independent adversarial audit is the correct next scrutiny.</w:t>
+        <w:t xml:space="preserve">(1) A1's channel shape is validated with real memorization at small scale, LLM scale, and now under corpus dilution (§7); the remaining gap is scale itself: our largest injection model is 1.5B parameters and the dilution sweep covers two models, one π, and three seeds. The replication showed seed noise is small where it matters (0.012 at the consolidation endpoint) and large at concentrated single exposure (0.31), and the per-claim conclusions quoted here are the seed-stable ones. The dose-1 diluted endpoint lands inside the field range in every seed; whether that interpolation holds at 70B-scale pretraining is an extrapolation we flag, not a measurement we own. (2) In the single-draw binary regime (most current leaderboards), (Λ, π) enter only through their product; the 2-D frontier earns its second dimension only under repeated draws or provenance strata; we say so plainly, and §10 is the constructive answer. (3) Λ calibration from pre/post-cutoff comparisons can be confounded by temporal drift; the pre-registration pairs items on difficulty and reports calibration uncertainty. (4) Both case studies are exploratory; the headline audit is governed by a pre-registration frozen before any confirmatory Γ* is computed. (5) ε-spillover should vanish at LLM corpus scale but is measured, not assumed. (6) This artifact was audited by its own author (four forensic iterations, including a critical binary-regime guard); an independent adversarial audit is the correct next scrutiny.</w:t>
       </w:r>
     </w:p>
     <w:p>
@@ -3751,7 +3787,7 @@
         </w:rPr>
         <w:t xml:space="preserve">Code, data artifacts, and this manuscript are public at </w:t>
       </w:r>
-      <w:hyperlink w:history="1" r:id="rIdlxisbnrxhjeqycr9dmiqq">
+      <w:hyperlink w:history="1" r:id="rIdcfu6fc2-qqr06jh-yivxy">
         <w:r>
           <w:rPr>
             <w:rFonts w:ascii="Times New Roman" w:cs="Times New Roman" w:eastAsia="Times New Roman" w:hAnsi="Times New Roman"/>
@@ -3849,7 +3885,7 @@
         </w:rPr>
         <w:t xml:space="preserve">The confirmatory analysis (§9.1) was pre-registered at </w:t>
       </w:r>
-      <w:hyperlink w:history="1" r:id="rId_mfycooxwonqjdkudptri">
+      <w:hyperlink w:history="1" r:id="rIduknjvqrbx4ou8miuw2tcz">
         <w:r>
           <w:rPr>
             <w:rFonts w:ascii="Times New Roman" w:cs="Times New Roman" w:eastAsia="Times New Roman" w:hAnsi="Times New Roman"/>

</xml_diff>

<commit_message>
Add VERIFICATION_LOG.md; state the independence gap in SS11 rather than imply it
Every attempt to re-run the artifact is now logged with the runner's
independence labelled author / coauthor / independent, appended never
rewritten, failures as welcome as clean runs. Entry 1 records the protocol
dry run honestly: run by the same agent that wrote the code, establishing
nothing about independent verification, and recording that the fifteen-minute
path FAILED first (gitignored data/oll_audit cache) before the fix in 6260eda.

SS11(6) now points at the log and says plainly that no independent audit has
happened, so a reader sees the absence rather than inferring it. Only an
`independent` entry can retire that limitation; a coauthor entry establishes
the smaller, real claim that the artifact runs on a second machine.

Co-Authored-By: Claude Opus 4.8 <noreply@anthropic.com>
</commit_message>
<xml_diff>
--- a/paper/contamsens_manuscript.docx
+++ b/paper/contamsens_manuscript.docx
@@ -2370,7 +2370,7 @@
         </w:rPr>
         <w:t xml:space="preserve">The protocol was pre-registered on the Open Science Framework (</w:t>
       </w:r>
-      <w:hyperlink w:history="1" r:id="rIddukfhxt088fhwz_zdha1n">
+      <w:hyperlink w:history="1" r:id="rId1wcfk37yvyrn_sbvjhlat">
         <w:r>
           <w:rPr>
             <w:rFonts w:ascii="Times New Roman" w:cs="Times New Roman" w:eastAsia="Times New Roman" w:hAnsi="Times New Roman"/>
@@ -3701,7 +3701,23 @@
           <w:sz w:val="22"/>
           <w:szCs w:val="22"/>
         </w:rPr>
-        <w:t xml:space="preserve">(1) A1's channel shape is validated with real memorization at small scale, LLM scale, and now under corpus dilution (§7); the remaining gap is scale itself: our largest injection model is 1.5B parameters and the dilution sweep covers two models, one π, and three seeds. The replication showed seed noise is small where it matters (0.012 at the consolidation endpoint) and large at concentrated single exposure (0.31), and the per-claim conclusions quoted here are the seed-stable ones. The dose-1 diluted endpoint lands inside the field range in every seed; whether that interpolation holds at 70B-scale pretraining is an extrapolation we flag, not a measurement we own. (2) In the single-draw binary regime (most current leaderboards), (Λ, π) enter only through their product; the 2-D frontier earns its second dimension only under repeated draws or provenance strata; we say so plainly, and §10 is the constructive answer. (3) Λ calibration from pre/post-cutoff comparisons can be confounded by temporal drift; the pre-registration pairs items on difficulty and reports calibration uncertainty. (4) Both case studies are exploratory; the headline audit is governed by a pre-registration frozen before any confirmatory Γ* is computed. (5) ε-spillover should vanish at LLM corpus scale but is measured, not assumed. (6) This artifact was audited by its own author (four forensic iterations, including a critical binary-regime guard); an independent adversarial audit is the correct next scrutiny.</w:t>
+        <w:t xml:space="preserve">(1) A1's channel shape is validated with real memorization at small scale, LLM scale, and now under corpus dilution (§7); the remaining gap is scale itself: our largest injection model is 1.5B parameters and the dilution sweep covers two models, one π, and three seeds. The replication showed seed noise is small where it matters (0.012 at the consolidation endpoint) and large at concentrated single exposure (0.31), and the per-claim conclusions quoted here are the seed-stable ones. The dose-1 diluted endpoint lands inside the field range in every seed; whether that interpolation holds at 70B-scale pretraining is an extrapolation we flag, not a measurement we own. (2) In the single-draw binary regime (most current leaderboards), (Λ, π) enter only through their product; the 2-D frontier earns its second dimension only under repeated draws or provenance strata; we say so plainly, and §10 is the constructive answer. (3) Λ calibration from pre/post-cutoff comparisons can be confounded by temporal drift; the pre-registration pairs items on difficulty and reports calibration uncertainty. (4) Both case studies are exploratory; the headline audit is governed by a pre-registration frozen before any confirmatory Γ* is computed. (5) ε-spillover should vanish at LLM corpus scale but is measured, not assumed. (6) This artifact was audited by its own author (four forensic iterations, including a critical binary-regime guard); an independent adversarial audit is the correct next scrutiny, and has not yet happened. We do not paper over this. The repository carries a verification log recording every attempt to re-run the artifact, each entry labelled by the runner's independence; at the time of writing it contains one author-level entry, which established only that the replication instructions execute from a clean clone (and fixed a step that did not). Readers can therefore see the absence of independent verification rather than infer it. The fifteen-minute path is documented in </w:t>
+      </w:r>
+      <w:r>
+        <w:rPr>
+          <w:rFonts w:ascii="Consolas" w:cs="Consolas" w:eastAsia="Consolas" w:hAnsi="Consolas"/>
+          <w:sz w:val="20"/>
+          <w:szCs w:val="20"/>
+        </w:rPr>
+        <w:t xml:space="preserve">REPLICATION.md</w:t>
+      </w:r>
+      <w:r>
+        <w:rPr>
+          <w:rFonts w:ascii="Times New Roman" w:cs="Times New Roman" w:eastAsia="Times New Roman" w:hAnsi="Times New Roman"/>
+          <w:sz w:val="22"/>
+          <w:szCs w:val="22"/>
+        </w:rPr>
+        <w:t xml:space="preserve">, and discrepancy reports of any size are solicited.</w:t>
       </w:r>
     </w:p>
     <w:p>
@@ -3787,7 +3803,7 @@
         </w:rPr>
         <w:t xml:space="preserve">Code, data artifacts, and this manuscript are public at </w:t>
       </w:r>
-      <w:hyperlink w:history="1" r:id="rIdcfu6fc2-qqr06jh-yivxy">
+      <w:hyperlink w:history="1" r:id="rIdtn9quuihvxdmgvtdkzwmi">
         <w:r>
           <w:rPr>
             <w:rFonts w:ascii="Times New Roman" w:cs="Times New Roman" w:eastAsia="Times New Roman" w:hAnsi="Times New Roman"/>
@@ -3885,7 +3901,7 @@
         </w:rPr>
         <w:t xml:space="preserve">The confirmatory analysis (§9.1) was pre-registered at </w:t>
       </w:r>
-      <w:hyperlink w:history="1" r:id="rIduknjvqrbx4ou8miuw2tcz">
+      <w:hyperlink w:history="1" r:id="rIdifivkxbz_hlen-sq7pkvb">
         <w:r>
           <w:rPr>
             <w:rFonts w:ascii="Times New Roman" w:cs="Times New Roman" w:eastAsia="Times New Roman" w:hAnsi="Times New Roman"/>

</xml_diff>